<commit_message>
Remove RPFM's automatic ±0.01 balance tolerance in Payment Component (RPFM 不再享有 ±0.01 容差——所有模块一律精确平衡)
M-7: the Confirm flow's default V8 tolerance is now exact equality (0) for
EVERY originModule, including RPFM. The legacy ±0.01 (Debit_Chk_Total_Pct()/
CHK_Total_Pct(), SSSS_Payment*.js) was a screen-level percentage-split slack,
not a GL-posting rule — a genuine rounding residual belongs on an explicit
rounding-difference leg, not swept under a tolerance. RPFM_BALANCE_TOLERANCE
is retained only as a deliberate, explicit per-call options.balanceTolerance
override; it is never applied automatically anymore.

Co-Authored-By: Claude Sonnet 5 <noreply@anthropic.com>
</commit_message>
<xml_diff>
--- a/lc-payment-wc/analysis/Payment-OAS-FSD-cn.docx
+++ b/lc-payment-wc/analysis/Payment-OAS-FSD-cn.docx
@@ -8359,6 +8359,108 @@
         </w:tc>
       </w:tr>
     </w:tbl>
+    <w:p>
+      <w:pPr>
+        <w:spacing w:before="360" w:after="120"/>
+      </w:pPr>
+      <w:r>
+        <w:rPr>
+          <w:b/>
+          <w:sz w:val="28"/>
+          <w:szCs w:val="28"/>
+        </w:rPr>
+        <w:t xml:space="preserve">规格同步 — 2026-08 加固评审(实现)</w:t>
+      </w:r>
+    </w:p>
+    <w:p>
+      <w:r>
+        <w:t xml:space="preserve">以下为评审后对 Payment Component 服务的实现加固变更,均已单元测试(261 测试,100% 覆盖)。本节记录以对齐规格。</w:t>
+      </w:r>
+    </w:p>
+    <w:p>
+      <w:pPr>
+        <w:spacing w:before="120"/>
+      </w:pPr>
+      <w:r>
+        <w:rPr>
+          <w:b/>
+        </w:rPr>
+        <w:t xml:space="preserve">C-2 — 报文感知的幂等: </w:t>
+      </w:r>
+      <w:r>
+        <w:t xml:space="preserve">对同一自然键(originModule, mainRef, sequence)、但报文体不同的重复 POST,现在返回 409 IDEMPOTENCY_KEY_CONFLICT,而非静默重放原结果;完全相同的重发仍重放(200)。请求的规范化指纹(SHA-256)作为系统/控制栏位与指令一并存储;OAS 响应体不变。(H-1 并发竞态由同一生产 DB 落地一并解决:UNIQUE(origin_module, main_ref, sequence) + 原子 upsert 比对指纹。)</w:t>
+      </w:r>
+    </w:p>
+    <w:p>
+      <w:pPr>
+        <w:spacing w:before="120"/>
+      </w:pPr>
+      <w:r>
+        <w:rPr>
+          <w:b/>
+        </w:rPr>
+        <w:t xml:space="preserve">H-2 — 币种小数位校验: </w:t>
+      </w:r>
+      <w:r>
+        <w:t xml:space="preserve">提交金额按币种小数位(Currency API decimals)校验:amountTxCcy 对交易币种、amountAccountCcy 对该腿币种、每个 Suspense entry 对其自身币种。超精度(如 JPY 100.50、EUR 1.234)以 400 拒绝;主档中没有的币种跳过(以真源为准)。</w:t>
+      </w:r>
+    </w:p>
+    <w:p>
+      <w:pPr>
+        <w:spacing w:before="120"/>
+      </w:pPr>
+      <w:r>
+        <w:rPr>
+          <w:b/>
+        </w:rPr>
+        <w:t xml:space="preserve">H-3 — SWIFT 32A 与 33B、UETR: </w:t>
+      </w:r>
+      <w:r>
+        <w:t xml:space="preserve">结算金额(32A,结算/账户币种)与指示金额(33B,交易币种)不再强制相等——跨币种时二者不同;新增 SwiftMessage.instructedCurrency 承载 33B 的币种(同币种支付不变)。每条报文现在都填 gpi UETR(v4 UUID),同一腿的 advice 与 cover 共享。serviceTypeId / isGpiMember 作为配置驱动的后续项。</w:t>
+      </w:r>
+    </w:p>
+    <w:p>
+      <w:pPr>
+        <w:spacing w:before="120"/>
+      </w:pPr>
+      <w:r>
+        <w:rPr>
+          <w:b/>
+        </w:rPr>
+        <w:t xml:space="preserve">M-1 — 拒绝负金额: </w:t>
+      </w:r>
+      <w:r>
+        <w:t xml:space="preserve">严格为负的调用方金额(提交腿 + Suspense entries)以 400 拒绝。方向由借/贷侧表达、绝不用符号;账上唯一的负是 FX 兌換的借贷对调,由服务端在对侧以正金额生成,发生在校验之后。</w:t>
+      </w:r>
+    </w:p>
+    <w:p>
+      <w:pPr>
+        <w:spacing w:before="120"/>
+      </w:pPr>
+      <w:r>
+        <w:rPr>
+          <w:b/>
+        </w:rPr>
+        <w:t xml:space="preserve">M-2 — 汇率必须大于 0: </w:t>
+      </w:r>
+      <w:r>
+        <w:t xml:space="preserve">零汇率以 400 拒绝;负数本就被 ExchangeRate 格式挡掉(无前导符号)。适用于所有汇率字段及 Suspense crossRate。</w:t>
+      </w:r>
+    </w:p>
+    <w:p>
+      <w:pPr>
+        <w:spacing w:before="120"/>
+      </w:pPr>
+      <w:r>
+        <w:rPr>
+          <w:b/>
+        </w:rPr>
+        <w:t xml:space="preserve">M-7 — 所有模块精确平衡: </w:t>
+      </w:r>
+      <w:r>
+        <w:t xml:space="preserve">移除 RPFM 自动 ±0.01 容差;Confirm 流程对所有 originModule(含 RPFM)要求精确 Dr = Cr。legacy ±0.01 本是屏幕层百分比拆分 slack,非过账规则。真实舍入残差应过到显式的舍入差额腿(后续项)。</w:t>
+      </w:r>
+    </w:p>
     <w:sectPr>
       <w:headerReference w:type="default" r:id="rId7"/>
       <w:footerReference w:type="default" r:id="rId8"/>

</xml_diff>